<commit_message>
v1 fix UI, DOCX template
</commit_message>
<xml_diff>
--- a/client/public/documents/dodatok-1-typovyi-dohovir.docx
+++ b/client/public/documents/dodatok-1-typovyi-dohovir.docx
@@ -1,7 +1,16 @@
 
 <file path=word/document.xml><?xml version="1.0" encoding="utf-8"?>
-<w:document xmlns:wpc="http://schemas.microsoft.com/office/word/2010/wordprocessingCanvas" xmlns:cx="http://schemas.microsoft.com/office/drawing/2014/chartex" xmlns:cx1="http://schemas.microsoft.com/office/drawing/2015/9/8/chartex" xmlns:mc="http://schemas.openxmlformats.org/markup-compatibility/2006" xmlns:o="urn:schemas-microsoft-com:office:office" xmlns:r="http://schemas.openxmlformats.org/officeDocument/2006/relationships" xmlns:m="http://schemas.openxmlformats.org/officeDocument/2006/math" xmlns:v="urn:schemas-microsoft-com:vml" xmlns:wp14="http://schemas.microsoft.com/office/word/2010/wordprocessingDrawing" xmlns:wp="http://schemas.openxmlformats.org/drawingml/2006/wordprocessingDrawing" xmlns:w10="urn:schemas-microsoft-com:office:word" xmlns:w="http://schemas.openxmlformats.org/wordprocessingml/2006/main" xmlns:w14="http://schemas.microsoft.com/office/word/2010/wordml" xmlns:w15="http://schemas.microsoft.com/office/word/2012/wordml" xmlns:w16se="http://schemas.microsoft.com/office/word/2015/wordml/symex" xmlns:wpg="http://schemas.microsoft.com/office/word/2010/wordprocessingGroup" xmlns:wpi="http://schemas.microsoft.com/office/word/2010/wordprocessingInk" xmlns:wne="http://schemas.microsoft.com/office/word/2006/wordml" xmlns:wps="http://schemas.microsoft.com/office/word/2010/wordprocessingShape" mc:Ignorable="w14 w15 w16se wp14">
+<w:document xmlns:wpc="http://schemas.microsoft.com/office/word/2010/wordprocessingCanvas" xmlns:cx="http://schemas.microsoft.com/office/drawing/2014/chartex" xmlns:cx1="http://schemas.microsoft.com/office/drawing/2015/9/8/chartex" xmlns:cx2="http://schemas.microsoft.com/office/drawing/2015/10/21/chartex" xmlns:cx3="http://schemas.microsoft.com/office/drawing/2016/5/9/chartex" xmlns:cx4="http://schemas.microsoft.com/office/drawing/2016/5/10/chartex" xmlns:cx5="http://schemas.microsoft.com/office/drawing/2016/5/11/chartex" xmlns:cx6="http://schemas.microsoft.com/office/drawing/2016/5/12/chartex" xmlns:cx7="http://schemas.microsoft.com/office/drawing/2016/5/13/chartex" xmlns:cx8="http://schemas.microsoft.com/office/drawing/2016/5/14/chartex" xmlns:mc="http://schemas.openxmlformats.org/markup-compatibility/2006" xmlns:aink="http://schemas.microsoft.com/office/drawing/2016/ink" xmlns:am3d="http://schemas.microsoft.com/office/drawing/2017/model3d" xmlns:o="urn:schemas-microsoft-com:office:office" xmlns:r="http://schemas.openxmlformats.org/officeDocument/2006/relationships" xmlns:m="http://schemas.openxmlformats.org/officeDocument/2006/math" xmlns:v="urn:schemas-microsoft-com:vml" xmlns:wp14="http://schemas.microsoft.com/office/word/2010/wordprocessingDrawing" xmlns:wp="http://schemas.openxmlformats.org/drawingml/2006/wordprocessingDrawing" xmlns:w10="urn:schemas-microsoft-com:office:word" xmlns:w="http://schemas.openxmlformats.org/wordprocessingml/2006/main" xmlns:w14="http://schemas.microsoft.com/office/word/2010/wordml" xmlns:w15="http://schemas.microsoft.com/office/word/2012/wordml" xmlns:w16cex="http://schemas.microsoft.com/office/word/2018/wordml/cex" xmlns:w16cid="http://schemas.microsoft.com/office/word/2016/wordml/cid" xmlns:w16="http://schemas.microsoft.com/office/word/2018/wordml" xmlns:w16sdtdh="http://schemas.microsoft.com/office/word/2020/wordml/sdtdatahash" xmlns:w16se="http://schemas.microsoft.com/office/word/2015/wordml/symex" xmlns:wpg="http://schemas.microsoft.com/office/word/2010/wordprocessingGroup" xmlns:wpi="http://schemas.microsoft.com/office/word/2010/wordprocessingInk" xmlns:wne="http://schemas.microsoft.com/office/word/2006/wordml" xmlns:wps="http://schemas.microsoft.com/office/word/2010/wordprocessingShape" mc:Ignorable="w14 w15 w16se w16cid w16 w16cex w16sdtdh wp14">
   <w:body>
+    <w:p>
+      <w:pPr>
+        <w:rPr>
+          <w:lang w:val="uk-UA"/>
+        </w:rPr>
+      </w:pPr>
+      <w:bookmarkStart w:id="0" w:name="_Hlk146632854"/>
+    </w:p>
+    <w:p/>
     <w:tbl>
       <w:tblPr>
         <w:tblStyle w:val="af3"/>
@@ -31,7 +40,6 @@
                 <w:lang w:val="az-Cyrl-AZ"/>
               </w:rPr>
             </w:pPr>
-            <w:bookmarkStart w:id="0" w:name="_Hlk146632854"/>
             <w:r>
               <w:rPr>
                 <w:lang w:val="az-Cyrl-AZ"/>
@@ -43,15 +51,7 @@
                 <w:lang w:val="az-Cyrl-AZ"/>
               </w:rPr>
               <w:br/>
-              <w:t>до</w:t>
-            </w:r>
-            <w:bookmarkStart w:id="1" w:name="_GoBack"/>
-            <w:bookmarkEnd w:id="1"/>
-            <w:r>
-              <w:rPr>
-                <w:lang w:val="az-Cyrl-AZ"/>
-              </w:rPr>
-              <w:t xml:space="preserve"> </w:t>
+              <w:t xml:space="preserve">до </w:t>
             </w:r>
             <w:r>
               <w:rPr>
@@ -1085,6 +1085,7 @@
                 <w:szCs w:val="24"/>
                 <w:lang w:val="az-Cyrl-AZ"/>
               </w:rPr>
+              <w:lastRenderedPageBreak/>
               <w:t>2</w:t>
             </w:r>
             <w:r>
@@ -1115,7 +1116,6 @@
               <w:rPr>
                 <w:lang w:val="az-Cyrl-AZ"/>
               </w:rPr>
-              <w:lastRenderedPageBreak/>
               <w:t xml:space="preserve">1. Оператор забезпечує приєднання об’єкта </w:t>
             </w:r>
             <w:r>
@@ -6004,8 +6004,8 @@
           <w:lang w:val="az-Cyrl-AZ"/>
         </w:rPr>
       </w:pPr>
-      <w:bookmarkStart w:id="2" w:name="_heading=h.gjdgxs" w:colFirst="0" w:colLast="0"/>
-      <w:bookmarkEnd w:id="2"/>
+      <w:bookmarkStart w:id="1" w:name="_heading=h.gjdgxs" w:colFirst="0" w:colLast="0"/>
+      <w:bookmarkEnd w:id="1"/>
     </w:p>
     <w:p>
       <w:pPr>
@@ -6073,7 +6073,7 @@
 </file>
 
 <file path=word/endnotes.xml><?xml version="1.0" encoding="utf-8"?>
-<w:endnotes xmlns:wpc="http://schemas.microsoft.com/office/word/2010/wordprocessingCanvas" xmlns:cx="http://schemas.microsoft.com/office/drawing/2014/chartex" xmlns:cx1="http://schemas.microsoft.com/office/drawing/2015/9/8/chartex" xmlns:mc="http://schemas.openxmlformats.org/markup-compatibility/2006" xmlns:o="urn:schemas-microsoft-com:office:office" xmlns:r="http://schemas.openxmlformats.org/officeDocument/2006/relationships" xmlns:m="http://schemas.openxmlformats.org/officeDocument/2006/math" xmlns:v="urn:schemas-microsoft-com:vml" xmlns:wp14="http://schemas.microsoft.com/office/word/2010/wordprocessingDrawing" xmlns:wp="http://schemas.openxmlformats.org/drawingml/2006/wordprocessingDrawing" xmlns:w10="urn:schemas-microsoft-com:office:word" xmlns:w="http://schemas.openxmlformats.org/wordprocessingml/2006/main" xmlns:w14="http://schemas.microsoft.com/office/word/2010/wordml" xmlns:w15="http://schemas.microsoft.com/office/word/2012/wordml" xmlns:w16se="http://schemas.microsoft.com/office/word/2015/wordml/symex" xmlns:wpg="http://schemas.microsoft.com/office/word/2010/wordprocessingGroup" xmlns:wpi="http://schemas.microsoft.com/office/word/2010/wordprocessingInk" xmlns:wne="http://schemas.microsoft.com/office/word/2006/wordml" xmlns:wps="http://schemas.microsoft.com/office/word/2010/wordprocessingShape" mc:Ignorable="w14 w15 w16se wp14">
+<w:endnotes xmlns:wpc="http://schemas.microsoft.com/office/word/2010/wordprocessingCanvas" xmlns:cx="http://schemas.microsoft.com/office/drawing/2014/chartex" xmlns:cx1="http://schemas.microsoft.com/office/drawing/2015/9/8/chartex" xmlns:cx2="http://schemas.microsoft.com/office/drawing/2015/10/21/chartex" xmlns:cx3="http://schemas.microsoft.com/office/drawing/2016/5/9/chartex" xmlns:cx4="http://schemas.microsoft.com/office/drawing/2016/5/10/chartex" xmlns:cx5="http://schemas.microsoft.com/office/drawing/2016/5/11/chartex" xmlns:cx6="http://schemas.microsoft.com/office/drawing/2016/5/12/chartex" xmlns:cx7="http://schemas.microsoft.com/office/drawing/2016/5/13/chartex" xmlns:cx8="http://schemas.microsoft.com/office/drawing/2016/5/14/chartex" xmlns:mc="http://schemas.openxmlformats.org/markup-compatibility/2006" xmlns:aink="http://schemas.microsoft.com/office/drawing/2016/ink" xmlns:am3d="http://schemas.microsoft.com/office/drawing/2017/model3d" xmlns:o="urn:schemas-microsoft-com:office:office" xmlns:r="http://schemas.openxmlformats.org/officeDocument/2006/relationships" xmlns:m="http://schemas.openxmlformats.org/officeDocument/2006/math" xmlns:v="urn:schemas-microsoft-com:vml" xmlns:wp14="http://schemas.microsoft.com/office/word/2010/wordprocessingDrawing" xmlns:wp="http://schemas.openxmlformats.org/drawingml/2006/wordprocessingDrawing" xmlns:w10="urn:schemas-microsoft-com:office:word" xmlns:w="http://schemas.openxmlformats.org/wordprocessingml/2006/main" xmlns:w14="http://schemas.microsoft.com/office/word/2010/wordml" xmlns:w15="http://schemas.microsoft.com/office/word/2012/wordml" xmlns:w16cex="http://schemas.microsoft.com/office/word/2018/wordml/cex" xmlns:w16cid="http://schemas.microsoft.com/office/word/2016/wordml/cid" xmlns:w16="http://schemas.microsoft.com/office/word/2018/wordml" xmlns:w16sdtdh="http://schemas.microsoft.com/office/word/2020/wordml/sdtdatahash" xmlns:w16se="http://schemas.microsoft.com/office/word/2015/wordml/symex" xmlns:wpg="http://schemas.microsoft.com/office/word/2010/wordprocessingGroup" xmlns:wpi="http://schemas.microsoft.com/office/word/2010/wordprocessingInk" xmlns:wne="http://schemas.microsoft.com/office/word/2006/wordml" xmlns:wps="http://schemas.microsoft.com/office/word/2010/wordprocessingShape" mc:Ignorable="w14 w15 w16se w16cid w16 w16cex w16sdtdh wp14">
   <w:endnote w:type="separator" w:id="-1">
     <w:p>
       <w:r>
@@ -6092,7 +6092,7 @@
 </file>
 
 <file path=word/footnotes.xml><?xml version="1.0" encoding="utf-8"?>
-<w:footnotes xmlns:wpc="http://schemas.microsoft.com/office/word/2010/wordprocessingCanvas" xmlns:cx="http://schemas.microsoft.com/office/drawing/2014/chartex" xmlns:cx1="http://schemas.microsoft.com/office/drawing/2015/9/8/chartex" xmlns:mc="http://schemas.openxmlformats.org/markup-compatibility/2006" xmlns:o="urn:schemas-microsoft-com:office:office" xmlns:r="http://schemas.openxmlformats.org/officeDocument/2006/relationships" xmlns:m="http://schemas.openxmlformats.org/officeDocument/2006/math" xmlns:v="urn:schemas-microsoft-com:vml" xmlns:wp14="http://schemas.microsoft.com/office/word/2010/wordprocessingDrawing" xmlns:wp="http://schemas.openxmlformats.org/drawingml/2006/wordprocessingDrawing" xmlns:w10="urn:schemas-microsoft-com:office:word" xmlns:w="http://schemas.openxmlformats.org/wordprocessingml/2006/main" xmlns:w14="http://schemas.microsoft.com/office/word/2010/wordml" xmlns:w15="http://schemas.microsoft.com/office/word/2012/wordml" xmlns:w16se="http://schemas.microsoft.com/office/word/2015/wordml/symex" xmlns:wpg="http://schemas.microsoft.com/office/word/2010/wordprocessingGroup" xmlns:wpi="http://schemas.microsoft.com/office/word/2010/wordprocessingInk" xmlns:wne="http://schemas.microsoft.com/office/word/2006/wordml" xmlns:wps="http://schemas.microsoft.com/office/word/2010/wordprocessingShape" mc:Ignorable="w14 w15 w16se wp14">
+<w:footnotes xmlns:wpc="http://schemas.microsoft.com/office/word/2010/wordprocessingCanvas" xmlns:cx="http://schemas.microsoft.com/office/drawing/2014/chartex" xmlns:cx1="http://schemas.microsoft.com/office/drawing/2015/9/8/chartex" xmlns:cx2="http://schemas.microsoft.com/office/drawing/2015/10/21/chartex" xmlns:cx3="http://schemas.microsoft.com/office/drawing/2016/5/9/chartex" xmlns:cx4="http://schemas.microsoft.com/office/drawing/2016/5/10/chartex" xmlns:cx5="http://schemas.microsoft.com/office/drawing/2016/5/11/chartex" xmlns:cx6="http://schemas.microsoft.com/office/drawing/2016/5/12/chartex" xmlns:cx7="http://schemas.microsoft.com/office/drawing/2016/5/13/chartex" xmlns:cx8="http://schemas.microsoft.com/office/drawing/2016/5/14/chartex" xmlns:mc="http://schemas.openxmlformats.org/markup-compatibility/2006" xmlns:aink="http://schemas.microsoft.com/office/drawing/2016/ink" xmlns:am3d="http://schemas.microsoft.com/office/drawing/2017/model3d" xmlns:o="urn:schemas-microsoft-com:office:office" xmlns:r="http://schemas.openxmlformats.org/officeDocument/2006/relationships" xmlns:m="http://schemas.openxmlformats.org/officeDocument/2006/math" xmlns:v="urn:schemas-microsoft-com:vml" xmlns:wp14="http://schemas.microsoft.com/office/word/2010/wordprocessingDrawing" xmlns:wp="http://schemas.openxmlformats.org/drawingml/2006/wordprocessingDrawing" xmlns:w10="urn:schemas-microsoft-com:office:word" xmlns:w="http://schemas.openxmlformats.org/wordprocessingml/2006/main" xmlns:w14="http://schemas.microsoft.com/office/word/2010/wordml" xmlns:w15="http://schemas.microsoft.com/office/word/2012/wordml" xmlns:w16cex="http://schemas.microsoft.com/office/word/2018/wordml/cex" xmlns:w16cid="http://schemas.microsoft.com/office/word/2016/wordml/cid" xmlns:w16="http://schemas.microsoft.com/office/word/2018/wordml" xmlns:w16sdtdh="http://schemas.microsoft.com/office/word/2020/wordml/sdtdatahash" xmlns:w16se="http://schemas.microsoft.com/office/word/2015/wordml/symex" xmlns:wpg="http://schemas.microsoft.com/office/word/2010/wordprocessingGroup" xmlns:wpi="http://schemas.microsoft.com/office/word/2010/wordprocessingInk" xmlns:wne="http://schemas.microsoft.com/office/word/2006/wordml" xmlns:wps="http://schemas.microsoft.com/office/word/2010/wordprocessingShape" mc:Ignorable="w14 w15 w16se w16cid w16 w16cex w16sdtdh wp14">
   <w:footnote w:type="separator" w:id="-1">
     <w:p>
       <w:r>
@@ -6111,7 +6111,7 @@
 </file>
 
 <file path=word/header1.xml><?xml version="1.0" encoding="utf-8"?>
-<w:hdr xmlns:wpc="http://schemas.microsoft.com/office/word/2010/wordprocessingCanvas" xmlns:cx="http://schemas.microsoft.com/office/drawing/2014/chartex" xmlns:cx1="http://schemas.microsoft.com/office/drawing/2015/9/8/chartex" xmlns:mc="http://schemas.openxmlformats.org/markup-compatibility/2006" xmlns:o="urn:schemas-microsoft-com:office:office" xmlns:r="http://schemas.openxmlformats.org/officeDocument/2006/relationships" xmlns:m="http://schemas.openxmlformats.org/officeDocument/2006/math" xmlns:v="urn:schemas-microsoft-com:vml" xmlns:wp14="http://schemas.microsoft.com/office/word/2010/wordprocessingDrawing" xmlns:wp="http://schemas.openxmlformats.org/drawingml/2006/wordprocessingDrawing" xmlns:w10="urn:schemas-microsoft-com:office:word" xmlns:w="http://schemas.openxmlformats.org/wordprocessingml/2006/main" xmlns:w14="http://schemas.microsoft.com/office/word/2010/wordml" xmlns:w15="http://schemas.microsoft.com/office/word/2012/wordml" xmlns:w16se="http://schemas.microsoft.com/office/word/2015/wordml/symex" xmlns:wpg="http://schemas.microsoft.com/office/word/2010/wordprocessingGroup" xmlns:wpi="http://schemas.microsoft.com/office/word/2010/wordprocessingInk" xmlns:wne="http://schemas.microsoft.com/office/word/2006/wordml" xmlns:wps="http://schemas.microsoft.com/office/word/2010/wordprocessingShape" mc:Ignorable="w14 w15 w16se wp14">
+<w:hdr xmlns:wpc="http://schemas.microsoft.com/office/word/2010/wordprocessingCanvas" xmlns:cx="http://schemas.microsoft.com/office/drawing/2014/chartex" xmlns:cx1="http://schemas.microsoft.com/office/drawing/2015/9/8/chartex" xmlns:cx2="http://schemas.microsoft.com/office/drawing/2015/10/21/chartex" xmlns:cx3="http://schemas.microsoft.com/office/drawing/2016/5/9/chartex" xmlns:cx4="http://schemas.microsoft.com/office/drawing/2016/5/10/chartex" xmlns:cx5="http://schemas.microsoft.com/office/drawing/2016/5/11/chartex" xmlns:cx6="http://schemas.microsoft.com/office/drawing/2016/5/12/chartex" xmlns:cx7="http://schemas.microsoft.com/office/drawing/2016/5/13/chartex" xmlns:cx8="http://schemas.microsoft.com/office/drawing/2016/5/14/chartex" xmlns:mc="http://schemas.openxmlformats.org/markup-compatibility/2006" xmlns:aink="http://schemas.microsoft.com/office/drawing/2016/ink" xmlns:am3d="http://schemas.microsoft.com/office/drawing/2017/model3d" xmlns:o="urn:schemas-microsoft-com:office:office" xmlns:r="http://schemas.openxmlformats.org/officeDocument/2006/relationships" xmlns:m="http://schemas.openxmlformats.org/officeDocument/2006/math" xmlns:v="urn:schemas-microsoft-com:vml" xmlns:wp14="http://schemas.microsoft.com/office/word/2010/wordprocessingDrawing" xmlns:wp="http://schemas.openxmlformats.org/drawingml/2006/wordprocessingDrawing" xmlns:w10="urn:schemas-microsoft-com:office:word" xmlns:w="http://schemas.openxmlformats.org/wordprocessingml/2006/main" xmlns:w14="http://schemas.microsoft.com/office/word/2010/wordml" xmlns:w15="http://schemas.microsoft.com/office/word/2012/wordml" xmlns:w16cex="http://schemas.microsoft.com/office/word/2018/wordml/cex" xmlns:w16cid="http://schemas.microsoft.com/office/word/2016/wordml/cid" xmlns:w16="http://schemas.microsoft.com/office/word/2018/wordml" xmlns:w16sdtdh="http://schemas.microsoft.com/office/word/2020/wordml/sdtdatahash" xmlns:w16se="http://schemas.microsoft.com/office/word/2015/wordml/symex" xmlns:wpg="http://schemas.microsoft.com/office/word/2010/wordprocessingGroup" xmlns:wpi="http://schemas.microsoft.com/office/word/2010/wordprocessingInk" xmlns:wne="http://schemas.microsoft.com/office/word/2006/wordml" xmlns:wps="http://schemas.microsoft.com/office/word/2010/wordprocessingShape" mc:Ignorable="w14 w15 w16se w16cid w16 w16cex w16sdtdh wp14">
   <w:p>
     <w:pPr>
       <w:pBdr>
@@ -6171,7 +6171,7 @@
 </file>
 
 <file path=word/header2.xml><?xml version="1.0" encoding="utf-8"?>
-<w:hdr xmlns:wpc="http://schemas.microsoft.com/office/word/2010/wordprocessingCanvas" xmlns:cx="http://schemas.microsoft.com/office/drawing/2014/chartex" xmlns:cx1="http://schemas.microsoft.com/office/drawing/2015/9/8/chartex" xmlns:mc="http://schemas.openxmlformats.org/markup-compatibility/2006" xmlns:o="urn:schemas-microsoft-com:office:office" xmlns:r="http://schemas.openxmlformats.org/officeDocument/2006/relationships" xmlns:m="http://schemas.openxmlformats.org/officeDocument/2006/math" xmlns:v="urn:schemas-microsoft-com:vml" xmlns:wp14="http://schemas.microsoft.com/office/word/2010/wordprocessingDrawing" xmlns:wp="http://schemas.openxmlformats.org/drawingml/2006/wordprocessingDrawing" xmlns:w10="urn:schemas-microsoft-com:office:word" xmlns:w="http://schemas.openxmlformats.org/wordprocessingml/2006/main" xmlns:w14="http://schemas.microsoft.com/office/word/2010/wordml" xmlns:w15="http://schemas.microsoft.com/office/word/2012/wordml" xmlns:w16se="http://schemas.microsoft.com/office/word/2015/wordml/symex" xmlns:wpg="http://schemas.microsoft.com/office/word/2010/wordprocessingGroup" xmlns:wpi="http://schemas.microsoft.com/office/word/2010/wordprocessingInk" xmlns:wne="http://schemas.microsoft.com/office/word/2006/wordml" xmlns:wps="http://schemas.microsoft.com/office/word/2010/wordprocessingShape" mc:Ignorable="w14 w15 w16se wp14">
+<w:hdr xmlns:wpc="http://schemas.microsoft.com/office/word/2010/wordprocessingCanvas" xmlns:cx="http://schemas.microsoft.com/office/drawing/2014/chartex" xmlns:cx1="http://schemas.microsoft.com/office/drawing/2015/9/8/chartex" xmlns:cx2="http://schemas.microsoft.com/office/drawing/2015/10/21/chartex" xmlns:cx3="http://schemas.microsoft.com/office/drawing/2016/5/9/chartex" xmlns:cx4="http://schemas.microsoft.com/office/drawing/2016/5/10/chartex" xmlns:cx5="http://schemas.microsoft.com/office/drawing/2016/5/11/chartex" xmlns:cx6="http://schemas.microsoft.com/office/drawing/2016/5/12/chartex" xmlns:cx7="http://schemas.microsoft.com/office/drawing/2016/5/13/chartex" xmlns:cx8="http://schemas.microsoft.com/office/drawing/2016/5/14/chartex" xmlns:mc="http://schemas.openxmlformats.org/markup-compatibility/2006" xmlns:aink="http://schemas.microsoft.com/office/drawing/2016/ink" xmlns:am3d="http://schemas.microsoft.com/office/drawing/2017/model3d" xmlns:o="urn:schemas-microsoft-com:office:office" xmlns:r="http://schemas.openxmlformats.org/officeDocument/2006/relationships" xmlns:m="http://schemas.openxmlformats.org/officeDocument/2006/math" xmlns:v="urn:schemas-microsoft-com:vml" xmlns:wp14="http://schemas.microsoft.com/office/word/2010/wordprocessingDrawing" xmlns:wp="http://schemas.openxmlformats.org/drawingml/2006/wordprocessingDrawing" xmlns:w10="urn:schemas-microsoft-com:office:word" xmlns:w="http://schemas.openxmlformats.org/wordprocessingml/2006/main" xmlns:w14="http://schemas.microsoft.com/office/word/2010/wordml" xmlns:w15="http://schemas.microsoft.com/office/word/2012/wordml" xmlns:w16cex="http://schemas.microsoft.com/office/word/2018/wordml/cex" xmlns:w16cid="http://schemas.microsoft.com/office/word/2016/wordml/cid" xmlns:w16="http://schemas.microsoft.com/office/word/2018/wordml" xmlns:w16sdtdh="http://schemas.microsoft.com/office/word/2020/wordml/sdtdatahash" xmlns:w16se="http://schemas.microsoft.com/office/word/2015/wordml/symex" xmlns:wpg="http://schemas.microsoft.com/office/word/2010/wordprocessingGroup" xmlns:wpi="http://schemas.microsoft.com/office/word/2010/wordprocessingInk" xmlns:wne="http://schemas.microsoft.com/office/word/2006/wordml" xmlns:wps="http://schemas.microsoft.com/office/word/2010/wordprocessingShape" mc:Ignorable="w14 w15 w16se w16cid w16 w16cex w16sdtdh wp14">
   <w:p>
     <w:pPr>
       <w:pBdr>
@@ -6244,7 +6244,7 @@
 </file>
 
 <file path=word/numbering.xml><?xml version="1.0" encoding="utf-8"?>
-<w:numbering xmlns:wpc="http://schemas.microsoft.com/office/word/2010/wordprocessingCanvas" xmlns:cx="http://schemas.microsoft.com/office/drawing/2014/chartex" xmlns:cx1="http://schemas.microsoft.com/office/drawing/2015/9/8/chartex" xmlns:mc="http://schemas.openxmlformats.org/markup-compatibility/2006" xmlns:o="urn:schemas-microsoft-com:office:office" xmlns:r="http://schemas.openxmlformats.org/officeDocument/2006/relationships" xmlns:m="http://schemas.openxmlformats.org/officeDocument/2006/math" xmlns:v="urn:schemas-microsoft-com:vml" xmlns:wp14="http://schemas.microsoft.com/office/word/2010/wordprocessingDrawing" xmlns:wp="http://schemas.openxmlformats.org/drawingml/2006/wordprocessingDrawing" xmlns:w10="urn:schemas-microsoft-com:office:word" xmlns:w="http://schemas.openxmlformats.org/wordprocessingml/2006/main" xmlns:w14="http://schemas.microsoft.com/office/word/2010/wordml" xmlns:w15="http://schemas.microsoft.com/office/word/2012/wordml" xmlns:w16se="http://schemas.microsoft.com/office/word/2015/wordml/symex" xmlns:wpg="http://schemas.microsoft.com/office/word/2010/wordprocessingGroup" xmlns:wpi="http://schemas.microsoft.com/office/word/2010/wordprocessingInk" xmlns:wne="http://schemas.microsoft.com/office/word/2006/wordml" xmlns:wps="http://schemas.microsoft.com/office/word/2010/wordprocessingShape" mc:Ignorable="w14 w15 w16se wp14">
+<w:numbering xmlns:wpc="http://schemas.microsoft.com/office/word/2010/wordprocessingCanvas" xmlns:cx="http://schemas.microsoft.com/office/drawing/2014/chartex" xmlns:cx1="http://schemas.microsoft.com/office/drawing/2015/9/8/chartex" xmlns:cx2="http://schemas.microsoft.com/office/drawing/2015/10/21/chartex" xmlns:cx3="http://schemas.microsoft.com/office/drawing/2016/5/9/chartex" xmlns:cx4="http://schemas.microsoft.com/office/drawing/2016/5/10/chartex" xmlns:cx5="http://schemas.microsoft.com/office/drawing/2016/5/11/chartex" xmlns:cx6="http://schemas.microsoft.com/office/drawing/2016/5/12/chartex" xmlns:cx7="http://schemas.microsoft.com/office/drawing/2016/5/13/chartex" xmlns:cx8="http://schemas.microsoft.com/office/drawing/2016/5/14/chartex" xmlns:mc="http://schemas.openxmlformats.org/markup-compatibility/2006" xmlns:aink="http://schemas.microsoft.com/office/drawing/2016/ink" xmlns:am3d="http://schemas.microsoft.com/office/drawing/2017/model3d" xmlns:o="urn:schemas-microsoft-com:office:office" xmlns:r="http://schemas.openxmlformats.org/officeDocument/2006/relationships" xmlns:m="http://schemas.openxmlformats.org/officeDocument/2006/math" xmlns:v="urn:schemas-microsoft-com:vml" xmlns:wp14="http://schemas.microsoft.com/office/word/2010/wordprocessingDrawing" xmlns:wp="http://schemas.openxmlformats.org/drawingml/2006/wordprocessingDrawing" xmlns:w10="urn:schemas-microsoft-com:office:word" xmlns:w="http://schemas.openxmlformats.org/wordprocessingml/2006/main" xmlns:w14="http://schemas.microsoft.com/office/word/2010/wordml" xmlns:w15="http://schemas.microsoft.com/office/word/2012/wordml" xmlns:w16cex="http://schemas.microsoft.com/office/word/2018/wordml/cex" xmlns:w16cid="http://schemas.microsoft.com/office/word/2016/wordml/cid" xmlns:w16="http://schemas.microsoft.com/office/word/2018/wordml" xmlns:w16sdtdh="http://schemas.microsoft.com/office/word/2020/wordml/sdtdatahash" xmlns:w16se="http://schemas.microsoft.com/office/word/2015/wordml/symex" xmlns:wpg="http://schemas.microsoft.com/office/word/2010/wordprocessingGroup" xmlns:wpi="http://schemas.microsoft.com/office/word/2010/wordprocessingInk" xmlns:wne="http://schemas.microsoft.com/office/word/2006/wordml" xmlns:wps="http://schemas.microsoft.com/office/word/2010/wordprocessingShape" mc:Ignorable="w14 w15 w16se w16cid w16 w16cex w16sdtdh wp14">
   <w:abstractNum w:abstractNumId="0" w15:restartNumberingAfterBreak="0">
     <w:nsid w:val="4E624934"/>
     <w:multiLevelType w:val="multilevel"/>
@@ -6391,7 +6391,7 @@
 </file>
 
 <file path=word/styles.xml><?xml version="1.0" encoding="utf-8"?>
-<w:styles xmlns:mc="http://schemas.openxmlformats.org/markup-compatibility/2006" xmlns:r="http://schemas.openxmlformats.org/officeDocument/2006/relationships" xmlns:w="http://schemas.openxmlformats.org/wordprocessingml/2006/main" xmlns:w14="http://schemas.microsoft.com/office/word/2010/wordml" xmlns:w15="http://schemas.microsoft.com/office/word/2012/wordml" xmlns:w16se="http://schemas.microsoft.com/office/word/2015/wordml/symex" mc:Ignorable="w14 w15 w16se">
+<w:styles xmlns:mc="http://schemas.openxmlformats.org/markup-compatibility/2006" xmlns:r="http://schemas.openxmlformats.org/officeDocument/2006/relationships" xmlns:w="http://schemas.openxmlformats.org/wordprocessingml/2006/main" xmlns:w14="http://schemas.microsoft.com/office/word/2010/wordml" xmlns:w15="http://schemas.microsoft.com/office/word/2012/wordml" xmlns:w16cex="http://schemas.microsoft.com/office/word/2018/wordml/cex" xmlns:w16cid="http://schemas.microsoft.com/office/word/2016/wordml/cid" xmlns:w16="http://schemas.microsoft.com/office/word/2018/wordml" xmlns:w16sdtdh="http://schemas.microsoft.com/office/word/2020/wordml/sdtdatahash" xmlns:w16se="http://schemas.microsoft.com/office/word/2015/wordml/symex" mc:Ignorable="w14 w15 w16se w16cid w16 w16cex w16sdtdh">
   <w:docDefaults>
     <w:rPrDefault>
       <w:rPr>
@@ -6403,7 +6403,7 @@
     </w:rPrDefault>
     <w:pPrDefault/>
   </w:docDefaults>
-  <w:latentStyles w:defLockedState="0" w:defUIPriority="99" w:defSemiHidden="0" w:defUnhideWhenUsed="0" w:defQFormat="0" w:count="371">
+  <w:latentStyles w:defLockedState="0" w:defUIPriority="99" w:defSemiHidden="0" w:defUnhideWhenUsed="0" w:defQFormat="0" w:count="376">
     <w:lsdException w:name="Normal" w:uiPriority="0" w:qFormat="1"/>
     <w:lsdException w:name="heading 1" w:uiPriority="9" w:qFormat="1"/>
     <w:lsdException w:name="heading 2" w:semiHidden="1" w:uiPriority="9" w:unhideWhenUsed="1" w:qFormat="1"/>
@@ -6509,7 +6509,6 @@
     <w:lsdException w:name="HTML Sample" w:semiHidden="1" w:unhideWhenUsed="1"/>
     <w:lsdException w:name="HTML Typewriter" w:semiHidden="1" w:unhideWhenUsed="1"/>
     <w:lsdException w:name="HTML Variable" w:semiHidden="1" w:unhideWhenUsed="1"/>
-    <w:lsdException w:name="Normal Table" w:semiHidden="1" w:unhideWhenUsed="1"/>
     <w:lsdException w:name="annotation subject" w:semiHidden="1" w:unhideWhenUsed="1"/>
     <w:lsdException w:name="No List" w:semiHidden="1" w:unhideWhenUsed="1"/>
     <w:lsdException w:name="Outline List 1" w:semiHidden="1" w:unhideWhenUsed="1"/>
@@ -6552,11 +6551,8 @@
     <w:lsdException w:name="Table Contemporary" w:semiHidden="1" w:unhideWhenUsed="1"/>
     <w:lsdException w:name="Table Elegant" w:semiHidden="1" w:unhideWhenUsed="1"/>
     <w:lsdException w:name="Table Professional" w:semiHidden="1" w:unhideWhenUsed="1"/>
-    <w:lsdException w:name="Table Subtle 1" w:semiHidden="1" w:unhideWhenUsed="1"/>
     <w:lsdException w:name="Table Subtle 2" w:semiHidden="1" w:unhideWhenUsed="1"/>
     <w:lsdException w:name="Table Web 1" w:semiHidden="1" w:unhideWhenUsed="1"/>
-    <w:lsdException w:name="Table Web 2" w:semiHidden="1" w:unhideWhenUsed="1"/>
-    <w:lsdException w:name="Table Web 3" w:semiHidden="1" w:unhideWhenUsed="1"/>
     <w:lsdException w:name="Balloon Text" w:semiHidden="1" w:unhideWhenUsed="1"/>
     <w:lsdException w:name="Table Grid" w:uiPriority="39"/>
     <w:lsdException w:name="Table Theme" w:semiHidden="1" w:unhideWhenUsed="1"/>
@@ -6775,6 +6771,11 @@
     <w:lsdException w:name="List Table 5 Dark Accent 6" w:uiPriority="50"/>
     <w:lsdException w:name="List Table 6 Colorful Accent 6" w:uiPriority="51"/>
     <w:lsdException w:name="List Table 7 Colorful Accent 6" w:uiPriority="52"/>
+    <w:lsdException w:name="Mention" w:semiHidden="1" w:unhideWhenUsed="1"/>
+    <w:lsdException w:name="Smart Hyperlink" w:semiHidden="1" w:unhideWhenUsed="1"/>
+    <w:lsdException w:name="Hashtag" w:semiHidden="1" w:unhideWhenUsed="1"/>
+    <w:lsdException w:name="Unresolved Mention" w:semiHidden="1" w:unhideWhenUsed="1"/>
+    <w:lsdException w:name="Smart Link" w:semiHidden="1" w:unhideWhenUsed="1"/>
   </w:latentStyles>
   <w:style w:type="paragraph" w:default="1" w:styleId="a">
     <w:name w:val="Normal"/>
@@ -7893,28 +7894,28 @@
 </file>
 
 <file path=customXml/item1.xml><?xml version="1.0" encoding="utf-8"?>
+<b:Sources xmlns:b="http://schemas.openxmlformats.org/officeDocument/2006/bibliography" xmlns="http://schemas.openxmlformats.org/officeDocument/2006/bibliography" SelectedStyle="\APASixthEditionOfficeOnline.xsl" StyleName="APA" Version="6"/>
+</file>
+
+<file path=customXml/item2.xml><?xml version="1.0" encoding="utf-8"?>
 <go:gDocsCustomXmlDataStorage xmlns:go="http://customooxmlschemas.google.com/" xmlns:r="http://schemas.openxmlformats.org/officeDocument/2006/relationships" uri="GoogleDocsCustomDataVersion2">
   <go:docsCustomData xmlns:go="http://customooxmlschemas.google.com/" roundtripDataSignature="AMtx7mjt/sYJNL/858M6vG8z97KTHKk2fQ==">CgMxLjAyCGguZ2pkZ3hzOAByITF6S0dlR3lpWERObzlnQWlWV2hzWkdnMUMzRWdnZVJiWA==</go:docsCustomData>
 </go:gDocsCustomXmlDataStorage>
 </file>
 
-<file path=customXml/item2.xml><?xml version="1.0" encoding="utf-8"?>
-<b:Sources xmlns:b="http://schemas.openxmlformats.org/officeDocument/2006/bibliography" xmlns="http://schemas.openxmlformats.org/officeDocument/2006/bibliography" SelectedStyle="\APASixthEditionOfficeOnline.xsl" StyleName="APA" Version="6"/>
+<file path=customXml/itemProps1.xml><?xml version="1.0" encoding="utf-8"?>
+<ds:datastoreItem xmlns:ds="http://schemas.openxmlformats.org/officeDocument/2006/customXml" ds:itemID="{A9CD5737-9C38-4E81-B9C9-B130303F4553}">
+  <ds:schemaRefs>
+    <ds:schemaRef ds:uri="http://schemas.openxmlformats.org/officeDocument/2006/bibliography"/>
+  </ds:schemaRefs>
+</ds:datastoreItem>
 </file>
 
-<file path=customXml/itemProps1.xml><?xml version="1.0" encoding="utf-8"?>
+<file path=customXml/itemProps2.xml><?xml version="1.0" encoding="utf-8"?>
 <ds:datastoreItem xmlns:ds="http://schemas.openxmlformats.org/officeDocument/2006/customXml" ds:itemID="{11111111-1234-1234-1234-123412341234}">
   <ds:schemaRefs>
     <ds:schemaRef ds:uri="http://customooxmlschemas.google.com/"/>
     <ds:schemaRef ds:uri="http://schemas.openxmlformats.org/officeDocument/2006/relationships"/>
   </ds:schemaRefs>
 </ds:datastoreItem>
-</file>
-
-<file path=customXml/itemProps2.xml><?xml version="1.0" encoding="utf-8"?>
-<ds:datastoreItem xmlns:ds="http://schemas.openxmlformats.org/officeDocument/2006/customXml" ds:itemID="{A9CD5737-9C38-4E81-B9C9-B130303F4553}">
-  <ds:schemaRefs>
-    <ds:schemaRef ds:uri="http://schemas.openxmlformats.org/officeDocument/2006/bibliography"/>
-  </ds:schemaRefs>
-</ds:datastoreItem>
 </file>
</xml_diff>